<commit_message>
feat(review): add deterministic consistency findings
</commit_message>
<xml_diff>
--- a/samples/fictional_tender.docx
+++ b/samples/fictional_tender.docx
@@ -20,7 +20,30 @@
         <w:pStyle w:val="Heading2"/>
       </w:pPr>
       <w:r>
-        <w:t>一、资格审查</w:t>
+        <w:t>一、项目基本信息</w:t>
+      </w:r>
+    </w:p>
+    <w:p>
+      <w:r>
+        <w:t>项目名称：星河市数字档案平台。</w:t>
+      </w:r>
+    </w:p>
+    <w:p>
+      <w:r>
+        <w:t>投标截止日期：2026年10月15日。</w:t>
+      </w:r>
+    </w:p>
+    <w:p>
+      <w:r>
+        <w:t>最高投标限价：人民币900000元。</w:t>
+      </w:r>
+    </w:p>
+    <w:p>
+      <w:pPr>
+        <w:pStyle w:val="Heading2"/>
+      </w:pPr>
+      <w:r>
+        <w:t>二、资格审查</w:t>
       </w:r>
     </w:p>
     <w:p>
@@ -33,7 +56,7 @@
         <w:pStyle w:val="Heading2"/>
       </w:pPr>
       <w:r>
-        <w:t>二、工期要求</w:t>
+        <w:t>三、工期要求</w:t>
       </w:r>
     </w:p>
     <w:p>
@@ -46,7 +69,7 @@
         <w:pStyle w:val="Heading2"/>
       </w:pPr>
       <w:r>
-        <w:t>三、评分标准</w:t>
+        <w:t>四、评分标准</w:t>
       </w:r>
     </w:p>
     <w:tbl>

</xml_diff>